<commit_message>
Renumber the screenshots so the sequence has no gap (02-08)
The folder jumped from 02 straight to 09 because 03 was never created.
Numbering the seven step screenshots 02-08, alongside the 01a/01b/01c
GitHub screenshots Paula still has to take, keeps the folder sequential.
The report was rebuilt with the new filenames.
</commit_message>
<xml_diff>
--- a/Assignment2/PAULAERIYA_BDA400_A02.docx
+++ b/Assignment2/PAULAERIYA_BDA400_A02.docx
@@ -927,10 +927,10 @@
         </w:rPr>
         <w:lastRenderedPageBreak/>
         <w:drawing>
-          <wp:inline distT="0" distB="0" distL="0" distR="0" wp14:anchorId="702697A8" wp14:editId="539A4602">
+          <wp:inline distT="0" distB="0" distL="0" distR="0" wp14:anchorId="18E1EC46" wp14:editId="5E8FD9F4">
             <wp:extent cx="5588000" cy="3143102"/>
             <wp:effectExtent l="0" t="0" r="0" b="635"/>
-            <wp:docPr id="435551482" name="Picture 1"/>
+            <wp:docPr id="837748952" name="Picture 1"/>
             <wp:cNvGraphicFramePr>
               <a:graphicFrameLocks xmlns:a="http://schemas.openxmlformats.org/drawingml/2006/main" noChangeAspect="1"/>
             </wp:cNvGraphicFramePr>
@@ -938,7 +938,7 @@
               <a:graphicData uri="http://schemas.openxmlformats.org/drawingml/2006/picture">
                 <pic:pic xmlns:pic="http://schemas.openxmlformats.org/drawingml/2006/picture">
                   <pic:nvPicPr>
-                    <pic:cNvPr id="435551482" name=""/>
+                    <pic:cNvPr id="837748952" name=""/>
                     <pic:cNvPicPr/>
                   </pic:nvPicPr>
                   <pic:blipFill>
@@ -1112,10 +1112,10 @@
           <w:noProof/>
         </w:rPr>
         <w:drawing>
-          <wp:inline distT="0" distB="0" distL="0" distR="0" wp14:anchorId="2E27AFBB" wp14:editId="3F4BA233">
+          <wp:inline distT="0" distB="0" distL="0" distR="0" wp14:anchorId="0839FE20" wp14:editId="10B3D8C6">
             <wp:extent cx="5588000" cy="3143102"/>
             <wp:effectExtent l="0" t="0" r="0" b="635"/>
-            <wp:docPr id="234035559" name="Picture 2"/>
+            <wp:docPr id="1801266311" name="Picture 2"/>
             <wp:cNvGraphicFramePr>
               <a:graphicFrameLocks xmlns:a="http://schemas.openxmlformats.org/drawingml/2006/main" noChangeAspect="1"/>
             </wp:cNvGraphicFramePr>
@@ -1123,7 +1123,7 @@
               <a:graphicData uri="http://schemas.openxmlformats.org/drawingml/2006/picture">
                 <pic:pic xmlns:pic="http://schemas.openxmlformats.org/drawingml/2006/picture">
                   <pic:nvPicPr>
-                    <pic:cNvPr id="234035559" name=""/>
+                    <pic:cNvPr id="1801266311" name=""/>
                     <pic:cNvPicPr/>
                   </pic:nvPicPr>
                   <pic:blipFill>
@@ -1779,10 +1779,10 @@
         </w:rPr>
         <w:lastRenderedPageBreak/>
         <w:drawing>
-          <wp:inline distT="0" distB="0" distL="0" distR="0" wp14:anchorId="6894315F" wp14:editId="21A12D17">
+          <wp:inline distT="0" distB="0" distL="0" distR="0" wp14:anchorId="61429FFC" wp14:editId="20810545">
             <wp:extent cx="5588000" cy="3143102"/>
             <wp:effectExtent l="0" t="0" r="0" b="635"/>
-            <wp:docPr id="1513164773" name="Picture 3"/>
+            <wp:docPr id="156652892" name="Picture 3"/>
             <wp:cNvGraphicFramePr>
               <a:graphicFrameLocks xmlns:a="http://schemas.openxmlformats.org/drawingml/2006/main" noChangeAspect="1"/>
             </wp:cNvGraphicFramePr>
@@ -1790,7 +1790,7 @@
               <a:graphicData uri="http://schemas.openxmlformats.org/drawingml/2006/picture">
                 <pic:pic xmlns:pic="http://schemas.openxmlformats.org/drawingml/2006/picture">
                   <pic:nvPicPr>
-                    <pic:cNvPr id="1513164773" name=""/>
+                    <pic:cNvPr id="156652892" name=""/>
                     <pic:cNvPicPr/>
                   </pic:nvPicPr>
                   <pic:blipFill>
@@ -2861,10 +2861,10 @@
         </w:rPr>
         <w:lastRenderedPageBreak/>
         <w:drawing>
-          <wp:inline distT="0" distB="0" distL="0" distR="0" wp14:anchorId="1C8DD3E6" wp14:editId="770BFACB">
+          <wp:inline distT="0" distB="0" distL="0" distR="0" wp14:anchorId="5961DA1A" wp14:editId="67436B87">
             <wp:extent cx="5588000" cy="3143102"/>
             <wp:effectExtent l="0" t="0" r="0" b="635"/>
-            <wp:docPr id="530094079" name="Picture 4"/>
+            <wp:docPr id="95512136" name="Picture 4"/>
             <wp:cNvGraphicFramePr>
               <a:graphicFrameLocks xmlns:a="http://schemas.openxmlformats.org/drawingml/2006/main" noChangeAspect="1"/>
             </wp:cNvGraphicFramePr>
@@ -2872,7 +2872,7 @@
               <a:graphicData uri="http://schemas.openxmlformats.org/drawingml/2006/picture">
                 <pic:pic xmlns:pic="http://schemas.openxmlformats.org/drawingml/2006/picture">
                   <pic:nvPicPr>
-                    <pic:cNvPr id="530094079" name=""/>
+                    <pic:cNvPr id="95512136" name=""/>
                     <pic:cNvPicPr/>
                   </pic:nvPicPr>
                   <pic:blipFill>
@@ -3074,10 +3074,10 @@
           <w:noProof/>
         </w:rPr>
         <w:drawing>
-          <wp:inline distT="0" distB="0" distL="0" distR="0" wp14:anchorId="18744C5B" wp14:editId="41F1DF30">
+          <wp:inline distT="0" distB="0" distL="0" distR="0" wp14:anchorId="7ADA52DE" wp14:editId="7E8C4BC3">
             <wp:extent cx="5588000" cy="3143102"/>
             <wp:effectExtent l="0" t="0" r="0" b="635"/>
-            <wp:docPr id="1813873521" name="Picture 5"/>
+            <wp:docPr id="195582395" name="Picture 5"/>
             <wp:cNvGraphicFramePr>
               <a:graphicFrameLocks xmlns:a="http://schemas.openxmlformats.org/drawingml/2006/main" noChangeAspect="1"/>
             </wp:cNvGraphicFramePr>
@@ -3085,7 +3085,7 @@
               <a:graphicData uri="http://schemas.openxmlformats.org/drawingml/2006/picture">
                 <pic:pic xmlns:pic="http://schemas.openxmlformats.org/drawingml/2006/picture">
                   <pic:nvPicPr>
-                    <pic:cNvPr id="1813873521" name=""/>
+                    <pic:cNvPr id="195582395" name=""/>
                     <pic:cNvPicPr/>
                   </pic:nvPicPr>
                   <pic:blipFill>
@@ -6027,10 +6027,10 @@
           <w:noProof/>
         </w:rPr>
         <w:drawing>
-          <wp:inline distT="0" distB="0" distL="0" distR="0" wp14:anchorId="325DCDE7" wp14:editId="3F47D637">
+          <wp:inline distT="0" distB="0" distL="0" distR="0" wp14:anchorId="2F1D5943" wp14:editId="3F1E0AAC">
             <wp:extent cx="5588000" cy="4022980"/>
             <wp:effectExtent l="0" t="0" r="0" b="0"/>
-            <wp:docPr id="385597648" name="Picture 6"/>
+            <wp:docPr id="643195401" name="Picture 6"/>
             <wp:cNvGraphicFramePr>
               <a:graphicFrameLocks xmlns:a="http://schemas.openxmlformats.org/drawingml/2006/main" noChangeAspect="1"/>
             </wp:cNvGraphicFramePr>
@@ -6038,7 +6038,7 @@
               <a:graphicData uri="http://schemas.openxmlformats.org/drawingml/2006/picture">
                 <pic:pic xmlns:pic="http://schemas.openxmlformats.org/drawingml/2006/picture">
                   <pic:nvPicPr>
-                    <pic:cNvPr id="385597648" name=""/>
+                    <pic:cNvPr id="643195401" name=""/>
                     <pic:cNvPicPr/>
                   </pic:nvPicPr>
                   <pic:blipFill>
@@ -11313,10 +11313,10 @@
         </w:rPr>
         <w:lastRenderedPageBreak/>
         <w:drawing>
-          <wp:inline distT="0" distB="0" distL="0" distR="0" wp14:anchorId="670FAB59" wp14:editId="2D08A251">
+          <wp:inline distT="0" distB="0" distL="0" distR="0" wp14:anchorId="635B1BCD" wp14:editId="1D50C83A">
             <wp:extent cx="5588000" cy="3143102"/>
             <wp:effectExtent l="0" t="0" r="0" b="635"/>
-            <wp:docPr id="918652251" name="Picture 7"/>
+            <wp:docPr id="1077099105" name="Picture 7"/>
             <wp:cNvGraphicFramePr>
               <a:graphicFrameLocks xmlns:a="http://schemas.openxmlformats.org/drawingml/2006/main" noChangeAspect="1"/>
             </wp:cNvGraphicFramePr>
@@ -11324,7 +11324,7 @@
               <a:graphicData uri="http://schemas.openxmlformats.org/drawingml/2006/picture">
                 <pic:pic xmlns:pic="http://schemas.openxmlformats.org/drawingml/2006/picture">
                   <pic:nvPicPr>
-                    <pic:cNvPr id="918652251" name=""/>
+                    <pic:cNvPr id="1077099105" name=""/>
                     <pic:cNvPicPr/>
                   </pic:nvPicPr>
                   <pic:blipFill>
@@ -11626,10 +11626,10 @@
           <w:noProof/>
         </w:rPr>
         <w:drawing>
-          <wp:inline distT="0" distB="0" distL="0" distR="0" wp14:anchorId="7122BFEC" wp14:editId="23DE3936">
+          <wp:inline distT="0" distB="0" distL="0" distR="0" wp14:anchorId="6CAE686B" wp14:editId="5FCFEF22">
             <wp:extent cx="5588000" cy="3026734"/>
             <wp:effectExtent l="0" t="0" r="0" b="2540"/>
-            <wp:docPr id="1192775715" name="Picture 8"/>
+            <wp:docPr id="65429429" name="Picture 8"/>
             <wp:cNvGraphicFramePr>
               <a:graphicFrameLocks xmlns:a="http://schemas.openxmlformats.org/drawingml/2006/main" noChangeAspect="1"/>
             </wp:cNvGraphicFramePr>
@@ -11637,7 +11637,7 @@
               <a:graphicData uri="http://schemas.openxmlformats.org/drawingml/2006/picture">
                 <pic:pic xmlns:pic="http://schemas.openxmlformats.org/drawingml/2006/picture">
                   <pic:nvPicPr>
-                    <pic:cNvPr id="1192775715" name=""/>
+                    <pic:cNvPr id="65429429" name=""/>
                     <pic:cNvPicPr/>
                   </pic:nvPicPr>
                   <pic:blipFill>
@@ -11701,10 +11701,10 @@
           <w:noProof/>
         </w:rPr>
         <w:drawing>
-          <wp:inline distT="0" distB="0" distL="0" distR="0" wp14:anchorId="41897152" wp14:editId="5E46E4C0">
+          <wp:inline distT="0" distB="0" distL="0" distR="0" wp14:anchorId="1EDA6017" wp14:editId="11A9EF4E">
             <wp:extent cx="5588000" cy="3026734"/>
             <wp:effectExtent l="0" t="0" r="0" b="2540"/>
-            <wp:docPr id="193354512" name="Picture 9"/>
+            <wp:docPr id="77288420" name="Picture 9"/>
             <wp:cNvGraphicFramePr>
               <a:graphicFrameLocks xmlns:a="http://schemas.openxmlformats.org/drawingml/2006/main" noChangeAspect="1"/>
             </wp:cNvGraphicFramePr>
@@ -11712,7 +11712,7 @@
               <a:graphicData uri="http://schemas.openxmlformats.org/drawingml/2006/picture">
                 <pic:pic xmlns:pic="http://schemas.openxmlformats.org/drawingml/2006/picture">
                   <pic:nvPicPr>
-                    <pic:cNvPr id="193354512" name=""/>
+                    <pic:cNvPr id="77288420" name=""/>
                     <pic:cNvPicPr/>
                   </pic:nvPicPr>
                   <pic:blipFill>
@@ -11777,10 +11777,10 @@
           <w:noProof/>
         </w:rPr>
         <w:drawing>
-          <wp:inline distT="0" distB="0" distL="0" distR="0" wp14:anchorId="1FD0ADE0" wp14:editId="0409B115">
+          <wp:inline distT="0" distB="0" distL="0" distR="0" wp14:anchorId="13D3B011" wp14:editId="0FE44A7F">
             <wp:extent cx="5588000" cy="3026734"/>
             <wp:effectExtent l="0" t="0" r="0" b="2540"/>
-            <wp:docPr id="897108647" name="Picture 10"/>
+            <wp:docPr id="1657480746" name="Picture 10"/>
             <wp:cNvGraphicFramePr>
               <a:graphicFrameLocks xmlns:a="http://schemas.openxmlformats.org/drawingml/2006/main" noChangeAspect="1"/>
             </wp:cNvGraphicFramePr>
@@ -11788,7 +11788,7 @@
               <a:graphicData uri="http://schemas.openxmlformats.org/drawingml/2006/picture">
                 <pic:pic xmlns:pic="http://schemas.openxmlformats.org/drawingml/2006/picture">
                   <pic:nvPicPr>
-                    <pic:cNvPr id="897108647" name=""/>
+                    <pic:cNvPr id="1657480746" name=""/>
                     <pic:cNvPicPr/>
                   </pic:nvPicPr>
                   <pic:blipFill>
@@ -11852,10 +11852,10 @@
           <w:noProof/>
         </w:rPr>
         <w:drawing>
-          <wp:inline distT="0" distB="0" distL="0" distR="0" wp14:anchorId="39773AFC" wp14:editId="41499C2D">
+          <wp:inline distT="0" distB="0" distL="0" distR="0" wp14:anchorId="01238D48" wp14:editId="51E8C9F2">
             <wp:extent cx="5588000" cy="3026734"/>
             <wp:effectExtent l="0" t="0" r="0" b="2540"/>
-            <wp:docPr id="1621971787" name="Picture 11"/>
+            <wp:docPr id="1214395754" name="Picture 11"/>
             <wp:cNvGraphicFramePr>
               <a:graphicFrameLocks xmlns:a="http://schemas.openxmlformats.org/drawingml/2006/main" noChangeAspect="1"/>
             </wp:cNvGraphicFramePr>
@@ -11863,7 +11863,7 @@
               <a:graphicData uri="http://schemas.openxmlformats.org/drawingml/2006/picture">
                 <pic:pic xmlns:pic="http://schemas.openxmlformats.org/drawingml/2006/picture">
                   <pic:nvPicPr>
-                    <pic:cNvPr id="1621971787" name=""/>
+                    <pic:cNvPr id="1214395754" name=""/>
                     <pic:cNvPicPr/>
                   </pic:nvPicPr>
                   <pic:blipFill>
@@ -11928,10 +11928,10 @@
           <w:noProof/>
         </w:rPr>
         <w:drawing>
-          <wp:inline distT="0" distB="0" distL="0" distR="0" wp14:anchorId="65640F7B" wp14:editId="204F8EA1">
+          <wp:inline distT="0" distB="0" distL="0" distR="0" wp14:anchorId="78ED9F88" wp14:editId="4E43CE5B">
             <wp:extent cx="5588000" cy="3026734"/>
             <wp:effectExtent l="0" t="0" r="0" b="2540"/>
-            <wp:docPr id="94985518" name="Picture 12"/>
+            <wp:docPr id="475723174" name="Picture 12"/>
             <wp:cNvGraphicFramePr>
               <a:graphicFrameLocks xmlns:a="http://schemas.openxmlformats.org/drawingml/2006/main" noChangeAspect="1"/>
             </wp:cNvGraphicFramePr>
@@ -11939,7 +11939,7 @@
               <a:graphicData uri="http://schemas.openxmlformats.org/drawingml/2006/picture">
                 <pic:pic xmlns:pic="http://schemas.openxmlformats.org/drawingml/2006/picture">
                   <pic:nvPicPr>
-                    <pic:cNvPr id="94985518" name=""/>
+                    <pic:cNvPr id="475723174" name=""/>
                     <pic:cNvPicPr/>
                   </pic:nvPicPr>
                   <pic:blipFill>
@@ -12003,10 +12003,10 @@
           <w:noProof/>
         </w:rPr>
         <w:drawing>
-          <wp:inline distT="0" distB="0" distL="0" distR="0" wp14:anchorId="3473548D" wp14:editId="4B1DA217">
+          <wp:inline distT="0" distB="0" distL="0" distR="0" wp14:anchorId="5009ED99" wp14:editId="3CF6C877">
             <wp:extent cx="5588000" cy="3868615"/>
             <wp:effectExtent l="0" t="0" r="0" b="0"/>
-            <wp:docPr id="1497490167" name="Picture 13"/>
+            <wp:docPr id="1407996152" name="Picture 13"/>
             <wp:cNvGraphicFramePr>
               <a:graphicFrameLocks xmlns:a="http://schemas.openxmlformats.org/drawingml/2006/main" noChangeAspect="1"/>
             </wp:cNvGraphicFramePr>
@@ -12014,7 +12014,7 @@
               <a:graphicData uri="http://schemas.openxmlformats.org/drawingml/2006/picture">
                 <pic:pic xmlns:pic="http://schemas.openxmlformats.org/drawingml/2006/picture">
                   <pic:nvPicPr>
-                    <pic:cNvPr id="1497490167" name=""/>
+                    <pic:cNvPr id="1407996152" name=""/>
                     <pic:cNvPicPr/>
                   </pic:nvPicPr>
                   <pic:blipFill>
@@ -12084,10 +12084,10 @@
           <w:noProof/>
         </w:rPr>
         <w:drawing>
-          <wp:inline distT="0" distB="0" distL="0" distR="0" wp14:anchorId="0C315D54" wp14:editId="26695702">
+          <wp:inline distT="0" distB="0" distL="0" distR="0" wp14:anchorId="0EDECCBE" wp14:editId="17EDC719">
             <wp:extent cx="5588000" cy="3260062"/>
             <wp:effectExtent l="0" t="0" r="0" b="0"/>
-            <wp:docPr id="2016909582" name="Picture 14"/>
+            <wp:docPr id="1006761444" name="Picture 14"/>
             <wp:cNvGraphicFramePr>
               <a:graphicFrameLocks xmlns:a="http://schemas.openxmlformats.org/drawingml/2006/main" noChangeAspect="1"/>
             </wp:cNvGraphicFramePr>
@@ -12095,7 +12095,7 @@
               <a:graphicData uri="http://schemas.openxmlformats.org/drawingml/2006/picture">
                 <pic:pic xmlns:pic="http://schemas.openxmlformats.org/drawingml/2006/picture">
                   <pic:nvPicPr>
-                    <pic:cNvPr id="2016909582" name=""/>
+                    <pic:cNvPr id="1006761444" name=""/>
                     <pic:cNvPicPr/>
                   </pic:nvPicPr>
                   <pic:blipFill>
@@ -12164,10 +12164,10 @@
           <w:noProof/>
         </w:rPr>
         <w:drawing>
-          <wp:inline distT="0" distB="0" distL="0" distR="0" wp14:anchorId="71539C87" wp14:editId="2F542AE4">
+          <wp:inline distT="0" distB="0" distL="0" distR="0" wp14:anchorId="41D121A6" wp14:editId="5A44DA61">
             <wp:extent cx="5588000" cy="3958266"/>
             <wp:effectExtent l="0" t="0" r="0" b="4445"/>
-            <wp:docPr id="1672411149" name="Picture 15"/>
+            <wp:docPr id="619744684" name="Picture 15"/>
             <wp:cNvGraphicFramePr>
               <a:graphicFrameLocks xmlns:a="http://schemas.openxmlformats.org/drawingml/2006/main" noChangeAspect="1"/>
             </wp:cNvGraphicFramePr>
@@ -12175,7 +12175,7 @@
               <a:graphicData uri="http://schemas.openxmlformats.org/drawingml/2006/picture">
                 <pic:pic xmlns:pic="http://schemas.openxmlformats.org/drawingml/2006/picture">
                   <pic:nvPicPr>
-                    <pic:cNvPr id="1672411149" name=""/>
+                    <pic:cNvPr id="619744684" name=""/>
                     <pic:cNvPicPr/>
                   </pic:nvPicPr>
                   <pic:blipFill>
@@ -30780,7 +30780,7 @@
     <w:link w:val="Heading1Char"/>
     <w:uiPriority w:val="9"/>
     <w:qFormat/>
-    <w:rsid w:val="00DE7557"/>
+    <w:rsid w:val="001D18F1"/>
     <w:pPr>
       <w:keepNext/>
       <w:keepLines/>
@@ -30802,7 +30802,7 @@
     <w:uiPriority w:val="9"/>
     <w:unhideWhenUsed/>
     <w:qFormat/>
-    <w:rsid w:val="00DE7557"/>
+    <w:rsid w:val="001D18F1"/>
     <w:pPr>
       <w:keepNext/>
       <w:keepLines/>
@@ -30825,7 +30825,7 @@
     <w:semiHidden/>
     <w:unhideWhenUsed/>
     <w:qFormat/>
-    <w:rsid w:val="00DE7557"/>
+    <w:rsid w:val="001D18F1"/>
     <w:pPr>
       <w:keepNext/>
       <w:keepLines/>
@@ -30848,7 +30848,7 @@
     <w:semiHidden/>
     <w:unhideWhenUsed/>
     <w:qFormat/>
-    <w:rsid w:val="00DE7557"/>
+    <w:rsid w:val="001D18F1"/>
     <w:pPr>
       <w:keepNext/>
       <w:keepLines/>
@@ -30871,7 +30871,7 @@
     <w:semiHidden/>
     <w:unhideWhenUsed/>
     <w:qFormat/>
-    <w:rsid w:val="00DE7557"/>
+    <w:rsid w:val="001D18F1"/>
     <w:pPr>
       <w:keepNext/>
       <w:keepLines/>
@@ -30892,7 +30892,7 @@
     <w:semiHidden/>
     <w:unhideWhenUsed/>
     <w:qFormat/>
-    <w:rsid w:val="00DE7557"/>
+    <w:rsid w:val="001D18F1"/>
     <w:pPr>
       <w:keepNext/>
       <w:keepLines/>
@@ -30915,7 +30915,7 @@
     <w:semiHidden/>
     <w:unhideWhenUsed/>
     <w:qFormat/>
-    <w:rsid w:val="00DE7557"/>
+    <w:rsid w:val="001D18F1"/>
     <w:pPr>
       <w:keepNext/>
       <w:keepLines/>
@@ -30936,7 +30936,7 @@
     <w:semiHidden/>
     <w:unhideWhenUsed/>
     <w:qFormat/>
-    <w:rsid w:val="00DE7557"/>
+    <w:rsid w:val="001D18F1"/>
     <w:pPr>
       <w:keepNext/>
       <w:keepLines/>
@@ -30958,7 +30958,7 @@
     <w:semiHidden/>
     <w:unhideWhenUsed/>
     <w:qFormat/>
-    <w:rsid w:val="00DE7557"/>
+    <w:rsid w:val="001D18F1"/>
     <w:pPr>
       <w:keepNext/>
       <w:keepLines/>
@@ -31022,7 +31022,7 @@
     <w:basedOn w:val="DefaultParagraphFont"/>
     <w:link w:val="Heading1"/>
     <w:uiPriority w:val="9"/>
-    <w:rsid w:val="00DE7557"/>
+    <w:rsid w:val="001D18F1"/>
     <w:rPr>
       <w:rFonts w:asciiTheme="majorHAnsi" w:eastAsiaTheme="majorEastAsia" w:hAnsiTheme="majorHAnsi" w:cstheme="majorBidi"/>
       <w:color w:val="2F5496" w:themeColor="accent1" w:themeShade="BF"/>
@@ -31035,7 +31035,7 @@
     <w:basedOn w:val="DefaultParagraphFont"/>
     <w:link w:val="Heading2"/>
     <w:uiPriority w:val="9"/>
-    <w:rsid w:val="00DE7557"/>
+    <w:rsid w:val="001D18F1"/>
     <w:rPr>
       <w:rFonts w:asciiTheme="majorHAnsi" w:eastAsiaTheme="majorEastAsia" w:hAnsiTheme="majorHAnsi" w:cstheme="majorBidi"/>
       <w:color w:val="2F5496" w:themeColor="accent1" w:themeShade="BF"/>
@@ -31049,7 +31049,7 @@
     <w:link w:val="Heading3"/>
     <w:uiPriority w:val="9"/>
     <w:semiHidden/>
-    <w:rsid w:val="00DE7557"/>
+    <w:rsid w:val="001D18F1"/>
     <w:rPr>
       <w:rFonts w:eastAsiaTheme="majorEastAsia" w:cstheme="majorBidi"/>
       <w:color w:val="2F5496" w:themeColor="accent1" w:themeShade="BF"/>
@@ -31063,7 +31063,7 @@
     <w:link w:val="Heading4"/>
     <w:uiPriority w:val="9"/>
     <w:semiHidden/>
-    <w:rsid w:val="00DE7557"/>
+    <w:rsid w:val="001D18F1"/>
     <w:rPr>
       <w:rFonts w:eastAsiaTheme="majorEastAsia" w:cstheme="majorBidi"/>
       <w:i/>
@@ -31077,7 +31077,7 @@
     <w:link w:val="Heading5"/>
     <w:uiPriority w:val="9"/>
     <w:semiHidden/>
-    <w:rsid w:val="00DE7557"/>
+    <w:rsid w:val="001D18F1"/>
     <w:rPr>
       <w:rFonts w:eastAsiaTheme="majorEastAsia" w:cstheme="majorBidi"/>
       <w:color w:val="2F5496" w:themeColor="accent1" w:themeShade="BF"/>
@@ -31089,7 +31089,7 @@
     <w:link w:val="Heading6"/>
     <w:uiPriority w:val="9"/>
     <w:semiHidden/>
-    <w:rsid w:val="00DE7557"/>
+    <w:rsid w:val="001D18F1"/>
     <w:rPr>
       <w:rFonts w:eastAsiaTheme="majorEastAsia" w:cstheme="majorBidi"/>
       <w:i/>
@@ -31103,7 +31103,7 @@
     <w:link w:val="Heading7"/>
     <w:uiPriority w:val="9"/>
     <w:semiHidden/>
-    <w:rsid w:val="00DE7557"/>
+    <w:rsid w:val="001D18F1"/>
     <w:rPr>
       <w:rFonts w:eastAsiaTheme="majorEastAsia" w:cstheme="majorBidi"/>
       <w:color w:val="595959" w:themeColor="text1" w:themeTint="A6"/>
@@ -31115,7 +31115,7 @@
     <w:link w:val="Heading8"/>
     <w:uiPriority w:val="9"/>
     <w:semiHidden/>
-    <w:rsid w:val="00DE7557"/>
+    <w:rsid w:val="001D18F1"/>
     <w:rPr>
       <w:rFonts w:eastAsiaTheme="majorEastAsia" w:cstheme="majorBidi"/>
       <w:i/>
@@ -31129,7 +31129,7 @@
     <w:link w:val="Heading9"/>
     <w:uiPriority w:val="9"/>
     <w:semiHidden/>
-    <w:rsid w:val="00DE7557"/>
+    <w:rsid w:val="001D18F1"/>
     <w:rPr>
       <w:rFonts w:eastAsiaTheme="majorEastAsia" w:cstheme="majorBidi"/>
       <w:color w:val="272727" w:themeColor="text1" w:themeTint="D8"/>
@@ -31142,7 +31142,7 @@
     <w:link w:val="TitleChar"/>
     <w:uiPriority w:val="10"/>
     <w:qFormat/>
-    <w:rsid w:val="00DE7557"/>
+    <w:rsid w:val="001D18F1"/>
     <w:pPr>
       <w:spacing w:after="80"/>
       <w:contextualSpacing/>
@@ -31160,7 +31160,7 @@
     <w:basedOn w:val="DefaultParagraphFont"/>
     <w:link w:val="Title"/>
     <w:uiPriority w:val="10"/>
-    <w:rsid w:val="00DE7557"/>
+    <w:rsid w:val="001D18F1"/>
     <w:rPr>
       <w:rFonts w:asciiTheme="majorHAnsi" w:eastAsiaTheme="majorEastAsia" w:hAnsiTheme="majorHAnsi" w:cstheme="majorBidi"/>
       <w:spacing w:val="-10"/>
@@ -31176,7 +31176,7 @@
     <w:link w:val="SubtitleChar"/>
     <w:uiPriority w:val="11"/>
     <w:qFormat/>
-    <w:rsid w:val="00DE7557"/>
+    <w:rsid w:val="001D18F1"/>
     <w:pPr>
       <w:numPr>
         <w:ilvl w:val="1"/>
@@ -31197,7 +31197,7 @@
     <w:basedOn w:val="DefaultParagraphFont"/>
     <w:link w:val="Subtitle"/>
     <w:uiPriority w:val="11"/>
-    <w:rsid w:val="00DE7557"/>
+    <w:rsid w:val="001D18F1"/>
     <w:rPr>
       <w:rFonts w:eastAsiaTheme="majorEastAsia" w:cstheme="majorBidi"/>
       <w:color w:val="595959" w:themeColor="text1" w:themeTint="A6"/>
@@ -31213,7 +31213,7 @@
     <w:link w:val="QuoteChar"/>
     <w:uiPriority w:val="29"/>
     <w:qFormat/>
-    <w:rsid w:val="00DE7557"/>
+    <w:rsid w:val="001D18F1"/>
     <w:pPr>
       <w:spacing w:before="160" w:after="160"/>
       <w:jc w:val="center"/>
@@ -31229,7 +31229,7 @@
     <w:basedOn w:val="DefaultParagraphFont"/>
     <w:link w:val="Quote"/>
     <w:uiPriority w:val="29"/>
-    <w:rsid w:val="00DE7557"/>
+    <w:rsid w:val="001D18F1"/>
     <w:rPr>
       <w:i/>
       <w:iCs/>
@@ -31241,7 +31241,7 @@
     <w:basedOn w:val="Normal"/>
     <w:uiPriority w:val="34"/>
     <w:qFormat/>
-    <w:rsid w:val="00DE7557"/>
+    <w:rsid w:val="001D18F1"/>
     <w:pPr>
       <w:ind w:left="720"/>
       <w:contextualSpacing/>
@@ -31252,7 +31252,7 @@
     <w:basedOn w:val="DefaultParagraphFont"/>
     <w:uiPriority w:val="21"/>
     <w:qFormat/>
-    <w:rsid w:val="00DE7557"/>
+    <w:rsid w:val="001D18F1"/>
     <w:rPr>
       <w:i/>
       <w:iCs/>
@@ -31266,7 +31266,7 @@
     <w:link w:val="IntenseQuoteChar"/>
     <w:uiPriority w:val="30"/>
     <w:qFormat/>
-    <w:rsid w:val="00DE7557"/>
+    <w:rsid w:val="001D18F1"/>
     <w:pPr>
       <w:pBdr>
         <w:top w:val="single" w:sz="4" w:space="10" w:color="2F5496" w:themeColor="accent1" w:themeShade="BF"/>
@@ -31287,7 +31287,7 @@
     <w:basedOn w:val="DefaultParagraphFont"/>
     <w:link w:val="IntenseQuote"/>
     <w:uiPriority w:val="30"/>
-    <w:rsid w:val="00DE7557"/>
+    <w:rsid w:val="001D18F1"/>
     <w:rPr>
       <w:i/>
       <w:iCs/>
@@ -31299,7 +31299,7 @@
     <w:basedOn w:val="DefaultParagraphFont"/>
     <w:uiPriority w:val="32"/>
     <w:qFormat/>
-    <w:rsid w:val="00DE7557"/>
+    <w:rsid w:val="001D18F1"/>
     <w:rPr>
       <w:b/>
       <w:bCs/>

</xml_diff>